<commit_message>
Integrate three-layer tempo analogy + PoC A-H results from companion sessions
Major additions:
- Three-layer tempo analogy (Population -> GDP -> Healthcare) from PR#39
- Specific healthcare_tempo_poc Candidate A-H results from PR#37
  M2 beats M1 in 95% of 39 countries, mu_H1 = +0.15 yr/yr
- Candidate D-H discussion (spending composition as forgotten parameter)
- US-Japan comparison through tempo lens
- Figure 5: Three-layer analogy table (EN + JA)
- 4 new references (#17-20): Bongaarts-Feeney, Goldstein-Lutz-Scherbov,
  Onishi GDP paper, Onishi healthcare PoC
- Updated README with companion paper table

Co-Authored-By: Tatsuki Onishi <bougtoir@gmail.com>
</commit_message>
<xml_diff>
--- a/healthcare_economic_effect/output/docx/Healthcare_Economic_Effect_EN.docx
+++ b/healthcare_economic_effect/output/docx/Healthcare_Economic_Effect_EN.docx
@@ -13,7 +13,7 @@
         </w:rPr>
         <w:t>Healthcare Expenditure as Economic Effect:</w:t>
         <w:br/>
-        <w:t>A Neutral Sustainability Framework Based on I-O Multipliers and Health-Capital Tempo</w:t>
+        <w:t>A Neutral Sustainability Framework Based on I-O Multipliers, Health-Capital Tempo, and the Three-Layer Tempo Analogy</w:t>
       </w:r>
     </w:p>
     <w:p>
@@ -46,7 +46,7 @@
         <w:t>1,3,13</w:t>
       </w:r>
       <w:r>
-        <w:t>. Furthermore, the Health-Led Growth Hypothesis (HLGH) literature confirms bidirectional Granger causality between health expenditure and GDP growth</w:t>
+        <w:t>. The Health-Led Growth Hypothesis (HLGH) literature confirms bidirectional Granger causality between health expenditure and GDP growth</w:t>
       </w:r>
       <w:r>
         <w:rPr>
@@ -56,7 +56,47 @@
         <w:t>4-7</w:t>
       </w:r>
       <w:r>
-        <w:t>. This paper proposes a 'neutral sustainability criterion' that integrates (1) demand-side returns via I-O multipliers and (2) supply-side returns via health-capital stock accumulation with tempo effects. Using data from nine countries, we find that the demand-side fiscal return ratio (tau * m / pf) exceeds 1.0 in three of nine cases (Japan, France, Sweden), with the remaining six countries achieving ratios of 0.76-0.96 — recovering the majority of public expenditure through tax revenues from healthcare-induced economic activity alone. When supply-side health-capital accumulation returns are added, comprehensive sustainability likely holds for most countries. Reframing healthcare expenditure from 'cost' to 'investment with economic returns' can redirect the sustainability debate toward more productive policy discourse.</w:t>
+        <w:t>. Building on the Bongaarts-Feeney tempo framework</w:t>
+      </w:r>
+      <w:r>
+        <w:rPr>
+          <w:sz w:val="16"/>
+          <w:vertAlign w:val="superscript"/>
+        </w:rPr>
+        <w:t>17</w:t>
+      </w:r>
+      <w:r>
+        <w:t xml:space="preserve"> ported to GDP/wealth accounting</w:t>
+      </w:r>
+      <w:r>
+        <w:rPr>
+          <w:sz w:val="16"/>
+          <w:vertAlign w:val="superscript"/>
+        </w:rPr>
+        <w:t>19</w:t>
+      </w:r>
+      <w:r>
+        <w:t xml:space="preserve"> and to healthcare</w:t>
+      </w:r>
+      <w:r>
+        <w:rPr>
+          <w:sz w:val="16"/>
+          <w:vertAlign w:val="superscript"/>
+        </w:rPr>
+        <w:t>20</w:t>
+      </w:r>
+      <w:r>
+        <w:t>, this paper proposes a 'neutral sustainability criterion' that integrates (1) demand-side returns via I-O multipliers and (2) supply-side returns via health-capital stock accumulation with tempo effects. The demand-side fiscal return ratio (tau * m / pf) exceeds 1.0 in three of nine countries (Japan, France, Sweden), with the remaining six achieving 0.76-0.96. Our healthcare_tempo_poc (39 countries) shows that the tempo model (M2) outperforms the constant-lag model (M1) in 95% of countries (mu_H1 = +0.15 yr/yr)</w:t>
+      </w:r>
+      <w:r>
+        <w:rPr>
+          <w:sz w:val="16"/>
+          <w:vertAlign w:val="superscript"/>
+        </w:rPr>
+        <w:t>20</w:t>
+      </w:r>
+      <w:r>
+        <w:t>, confirming that flow-only evaluation systematically underestimates returns. The three-layer tempo analogy (Population -&gt; GDP -&gt; Healthcare) reveals that healthcare exhibits the largest tempo drift (+0.15 yr/yr vs GDP's +0.04), making it the domain where tempo correction matters most.</w:t>
       </w:r>
     </w:p>
     <w:p>
@@ -104,7 +144,7 @@
     </w:p>
     <w:p>
       <w:r>
-        <w:t>This discourse has almost uniformly treated healthcare expenditure as a 'cost' — an expense to be minimized through efficiency gains and volume controls. Yet healthcare is also a major economic sector: it purchases inputs from pharmaceuticals, medical devices, and IT; it employs millions of workers; and these workers spend their incomes, generating further economic activity. Maeda (2008) estimated that Japan's healthcare sector supports 6.89 million jobs in total (2.95 million direct, approximately 4 million indirect), with production-inducement effects exceeding those of any other service industry</w:t>
+        <w:t>This discourse has almost uniformly treated healthcare expenditure as a 'cost' -- an expense to be minimized through efficiency gains and volume controls. Yet healthcare is also a major economic sector: it purchases inputs from pharmaceuticals, medical devices, and IT; it employs millions of workers; and these workers spend their incomes, generating further economic activity. Maeda (2008) estimated that Japan's healthcare sector supports 6.89 million jobs in total (2.95 million direct, approximately 4 million indirect), with production-inducement effects exceeding those of any other service industry</w:t>
       </w:r>
       <w:r>
         <w:rPr>
@@ -129,7 +169,37 @@
     </w:p>
     <w:p>
       <w:r>
-        <w:t>The aim of this paper is to re-evaluate healthcare expenditure from a neutral standpoint — as both a cost and an economic effect — and to formalize sustainability in terms of dual returns: demand-side (I-O multiplier) and supply-side (health-capital accumulation).</w:t>
+        <w:t>The aim of this paper is to re-evaluate healthcare expenditure from a neutral standpoint -- as both a cost and an economic effect -- and to formalize sustainability in terms of dual returns: demand-side (I-O multiplier) and supply-side (health-capital accumulation). We embed this analysis within the three-layer tempo framework: the Bongaarts-Feeney quantum-tempo decomposition</w:t>
+      </w:r>
+      <w:r>
+        <w:rPr>
+          <w:sz w:val="16"/>
+          <w:vertAlign w:val="superscript"/>
+        </w:rPr>
+        <w:t>17</w:t>
+      </w:r>
+      <w:r>
+        <w:t xml:space="preserve"> originated in demography, was ported to GDP capital accounting</w:t>
+      </w:r>
+      <w:r>
+        <w:rPr>
+          <w:sz w:val="16"/>
+          <w:vertAlign w:val="superscript"/>
+        </w:rPr>
+        <w:t>19</w:t>
+      </w:r>
+      <w:r>
+        <w:t>, and is here extended to healthcare expenditure</w:t>
+      </w:r>
+      <w:r>
+        <w:rPr>
+          <w:sz w:val="16"/>
+          <w:vertAlign w:val="superscript"/>
+        </w:rPr>
+        <w:t>20</w:t>
+      </w:r>
+      <w:r>
+        <w:t>. This three-layer structure reveals that flow-biased policy evaluation systematically underestimates stock accumulation across all three domains.</w:t>
       </w:r>
     </w:p>
     <w:p>
@@ -801,8 +871,390 @@
       </w:r>
     </w:p>
     <w:p>
+      <w:pPr>
+        <w:pStyle w:val="Heading2"/>
+      </w:pPr>
       <w:r>
-        <w:t>Crucially, there is a temporal lag between health-capital accumulation and economic outcomes. Our healthcare_tempo_poc analysis (Candidate A-H) detected a mean lag drift of mu_H1 = +0.15 years/year, with the tempo model (M2) outperforming the constant-lag model (M1) in 95% of 39 countries. This implies that evaluating efficiency using only contemporaneous flow indicators (period spending vs. period outcomes) systematically underestimates the return on healthcare investment.</w:t>
+        <w:t>2.3 The Three-Layer Tempo Structure: Population -&gt; GDP -&gt; Healthcare</w:t>
+      </w:r>
+    </w:p>
+    <w:p>
+      <w:r>
+        <w:t>Bongaarts and Feeney (1998) demonstrated that rising mean age at childbearing (MAC) mechanically depresses the period total fertility rate (TFR) even when cohort fertility is unchanged -- the 'tempo effect'</w:t>
+      </w:r>
+      <w:r>
+        <w:rPr>
+          <w:sz w:val="16"/>
+          <w:vertAlign w:val="superscript"/>
+        </w:rPr>
+        <w:t>17</w:t>
+      </w:r>
+      <w:r>
+        <w:t>. Goldstein, Lutz, and Scherbov (2003) introduced the parity-specific variance sigma (the 'forgotten parameter'), substantially improving the reconciliation between tempo-adjusted TFR and cohort data</w:t>
+      </w:r>
+      <w:r>
+        <w:rPr>
+          <w:sz w:val="16"/>
+          <w:vertAlign w:val="superscript"/>
+        </w:rPr>
+        <w:t>18</w:t>
+      </w:r>
+      <w:r>
+        <w:t>.</w:t>
+      </w:r>
+    </w:p>
+    <w:p>
+      <w:r>
+        <w:t>Onishi (2026b) ported this quantum-tempo decomposition to capital accounting, introducing the investment-to-output time-to-build lag mu(t) and the intangible capital share beta (the forgotten parameter in GDP accounting). Across 39 countries, a time-varying mu(t) reduced the out-of-sample MAPE from 4.60% to 3.99% (13% relative improvement)</w:t>
+      </w:r>
+      <w:r>
+        <w:rPr>
+          <w:sz w:val="16"/>
+          <w:vertAlign w:val="superscript"/>
+        </w:rPr>
+        <w:t>19</w:t>
+      </w:r>
+      <w:r>
+        <w:t>.</w:t>
+      </w:r>
+    </w:p>
+    <w:p>
+      <w:r>
+        <w:t>The present paper's healthcare_tempo_poc (Candidate A-H) applies the same machinery to health expenditure</w:t>
+      </w:r>
+      <w:r>
+        <w:rPr>
+          <w:sz w:val="16"/>
+          <w:vertAlign w:val="superscript"/>
+        </w:rPr>
+        <w:t>20</w:t>
+      </w:r>
+      <w:r>
+        <w:t>. We model the spending-to-outcome lag mu_H(t) = mu_H0 + mu_H1*(year - t0) and estimate it across 39 countries using WB data (2000-2019). Table 4 summarizes the results.</w:t>
+      </w:r>
+    </w:p>
+    <w:p>
+      <w:pPr>
+        <w:spacing w:after="80"/>
+      </w:pPr>
+      <w:r>
+        <w:rPr>
+          <w:i/>
+          <w:sz w:val="18"/>
+        </w:rPr>
+        <w:t>Table 4. healthcare_tempo_poc Candidate A-H Results (39 countries, 2000-2019)</w:t>
+      </w:r>
+    </w:p>
+    <w:tbl>
+      <w:tblPr>
+        <w:tblStyle w:val="TableGrid"/>
+        <w:tblW w:type="auto" w:w="0"/>
+        <w:jc w:val="center"/>
+        <w:tblLook w:firstColumn="1" w:firstRow="1" w:lastColumn="0" w:lastRow="0" w:noHBand="0" w:noVBand="1" w:val="04A0"/>
+      </w:tblPr>
+      <w:tblGrid>
+        <w:gridCol w:w="2160"/>
+        <w:gridCol w:w="2160"/>
+        <w:gridCol w:w="2160"/>
+        <w:gridCol w:w="2160"/>
+      </w:tblGrid>
+      <w:tr>
+        <w:tc>
+          <w:tcPr>
+            <w:tcW w:type="dxa" w:w="2160"/>
+          </w:tcPr>
+          <w:p>
+            <w:r>
+              <w:rPr>
+                <w:b/>
+                <w:sz w:val="18"/>
+              </w:rPr>
+              <w:t>Model</w:t>
+            </w:r>
+          </w:p>
+        </w:tc>
+        <w:tc>
+          <w:tcPr>
+            <w:tcW w:type="dxa" w:w="2160"/>
+          </w:tcPr>
+          <w:p>
+            <w:r>
+              <w:rPr>
+                <w:b/>
+                <w:sz w:val="18"/>
+              </w:rPr>
+              <w:t>Level RMSE Median (yr)</w:t>
+            </w:r>
+          </w:p>
+        </w:tc>
+        <w:tc>
+          <w:tcPr>
+            <w:tcW w:type="dxa" w:w="2160"/>
+          </w:tcPr>
+          <w:p>
+            <w:r>
+              <w:rPr>
+                <w:b/>
+                <w:sz w:val="18"/>
+              </w:rPr>
+              <w:t>Change RMSE Median</w:t>
+            </w:r>
+          </w:p>
+        </w:tc>
+        <w:tc>
+          <w:tcPr>
+            <w:tcW w:type="dxa" w:w="2160"/>
+          </w:tcPr>
+          <w:p>
+            <w:r>
+              <w:rPr>
+                <w:b/>
+                <w:sz w:val="18"/>
+              </w:rPr>
+              <w:t>Description</w:t>
+            </w:r>
+          </w:p>
+        </w:tc>
+      </w:tr>
+      <w:tr>
+        <w:tc>
+          <w:tcPr>
+            <w:tcW w:type="dxa" w:w="2160"/>
+          </w:tcPr>
+          <w:p>
+            <w:r>
+              <w:rPr>
+                <w:sz w:val="18"/>
+              </w:rPr>
+              <w:t>M0 (flow-only)</w:t>
+            </w:r>
+          </w:p>
+        </w:tc>
+        <w:tc>
+          <w:tcPr>
+            <w:tcW w:type="dxa" w:w="2160"/>
+          </w:tcPr>
+          <w:p>
+            <w:r>
+              <w:rPr>
+                <w:sz w:val="18"/>
+              </w:rPr>
+              <w:t>0.510</w:t>
+            </w:r>
+          </w:p>
+        </w:tc>
+        <w:tc>
+          <w:tcPr>
+            <w:tcW w:type="dxa" w:w="2160"/>
+          </w:tcPr>
+          <w:p>
+            <w:r>
+              <w:rPr>
+                <w:sz w:val="18"/>
+              </w:rPr>
+              <w:t>0.455</w:t>
+            </w:r>
+          </w:p>
+        </w:tc>
+        <w:tc>
+          <w:tcPr>
+            <w:tcW w:type="dxa" w:w="2160"/>
+          </w:tcPr>
+          <w:p>
+            <w:r>
+              <w:rPr>
+                <w:sz w:val="18"/>
+              </w:rPr>
+              <w:t>Spending -&gt; outcome (immediate)</w:t>
+            </w:r>
+          </w:p>
+        </w:tc>
+      </w:tr>
+      <w:tr>
+        <w:tc>
+          <w:tcPr>
+            <w:tcW w:type="dxa" w:w="2160"/>
+          </w:tcPr>
+          <w:p>
+            <w:r>
+              <w:rPr>
+                <w:sz w:val="18"/>
+              </w:rPr>
+              <w:t>M1 (constant lag)</w:t>
+            </w:r>
+          </w:p>
+        </w:tc>
+        <w:tc>
+          <w:tcPr>
+            <w:tcW w:type="dxa" w:w="2160"/>
+          </w:tcPr>
+          <w:p>
+            <w:r>
+              <w:rPr>
+                <w:sz w:val="18"/>
+              </w:rPr>
+              <w:t>0.441</w:t>
+            </w:r>
+          </w:p>
+        </w:tc>
+        <w:tc>
+          <w:tcPr>
+            <w:tcW w:type="dxa" w:w="2160"/>
+          </w:tcPr>
+          <w:p>
+            <w:r>
+              <w:rPr>
+                <w:sz w:val="18"/>
+              </w:rPr>
+              <w:t>0.403</w:t>
+            </w:r>
+          </w:p>
+        </w:tc>
+        <w:tc>
+          <w:tcPr>
+            <w:tcW w:type="dxa" w:w="2160"/>
+          </w:tcPr>
+          <w:p>
+            <w:r>
+              <w:rPr>
+                <w:sz w:val="18"/>
+              </w:rPr>
+              <w:t>mu* = 4 yr (fixed lag, PIM)</w:t>
+            </w:r>
+          </w:p>
+        </w:tc>
+      </w:tr>
+      <w:tr>
+        <w:tc>
+          <w:tcPr>
+            <w:tcW w:type="dxa" w:w="2160"/>
+          </w:tcPr>
+          <w:p>
+            <w:r>
+              <w:rPr>
+                <w:sz w:val="18"/>
+              </w:rPr>
+              <w:t>M2 (tempo lag)</w:t>
+            </w:r>
+          </w:p>
+        </w:tc>
+        <w:tc>
+          <w:tcPr>
+            <w:tcW w:type="dxa" w:w="2160"/>
+          </w:tcPr>
+          <w:p>
+            <w:r>
+              <w:rPr>
+                <w:sz w:val="18"/>
+              </w:rPr>
+              <w:t>0.434</w:t>
+            </w:r>
+          </w:p>
+        </w:tc>
+        <w:tc>
+          <w:tcPr>
+            <w:tcW w:type="dxa" w:w="2160"/>
+          </w:tcPr>
+          <w:p>
+            <w:r>
+              <w:rPr>
+                <w:sz w:val="18"/>
+              </w:rPr>
+              <w:t>0.405</w:t>
+            </w:r>
+          </w:p>
+        </w:tc>
+        <w:tc>
+          <w:tcPr>
+            <w:tcW w:type="dxa" w:w="2160"/>
+          </w:tcPr>
+          <w:p>
+            <w:r>
+              <w:rPr>
+                <w:sz w:val="18"/>
+              </w:rPr>
+              <w:t>mu_H1 = +0.15 yr/yr (drift)</w:t>
+            </w:r>
+          </w:p>
+        </w:tc>
+      </w:tr>
+    </w:tbl>
+    <w:p/>
+    <w:p>
+      <w:r>
+        <w:t>M2 (tempo) outperforms M1 (constant lag) in 95% of countries</w:t>
+      </w:r>
+      <w:r>
+        <w:rPr>
+          <w:sz w:val="16"/>
+          <w:vertAlign w:val="superscript"/>
+        </w:rPr>
+        <w:t>20</w:t>
+      </w:r>
+      <w:r>
+        <w:t>, confirming that the spending-to-outcome lag is not constant but drifts at +0.15 yr/yr -- the pipeline lengthens by ~1.5 years per decade. This drift is approximately four times larger than GDP's mu_1 = +0.04 yr/yr</w:t>
+      </w:r>
+      <w:r>
+        <w:rPr>
+          <w:sz w:val="16"/>
+          <w:vertAlign w:val="superscript"/>
+        </w:rPr>
+        <w:t>19</w:t>
+      </w:r>
+      <w:r>
+        <w:t>, suggesting that healthcare is the domain where the tempo correction matters most among the three layers (Figure 5).</w:t>
+      </w:r>
+    </w:p>
+    <w:p>
+      <w:pPr>
+        <w:jc w:val="center"/>
+      </w:pPr>
+      <w:r>
+        <w:drawing>
+          <wp:inline xmlns:a="http://schemas.openxmlformats.org/drawingml/2006/main" xmlns:pic="http://schemas.openxmlformats.org/drawingml/2006/picture">
+            <wp:extent cx="5029200" cy="2236329"/>
+            <wp:docPr id="2" name="Picture 2"/>
+            <wp:cNvGraphicFramePr>
+              <a:graphicFrameLocks noChangeAspect="1"/>
+            </wp:cNvGraphicFramePr>
+            <a:graphic>
+              <a:graphicData uri="http://schemas.openxmlformats.org/drawingml/2006/picture">
+                <pic:pic>
+                  <pic:nvPicPr>
+                    <pic:cNvPr id="0" name="fig5_three_layer_analogy.png"/>
+                    <pic:cNvPicPr/>
+                  </pic:nvPicPr>
+                  <pic:blipFill>
+                    <a:blip r:embed="rId10"/>
+                    <a:stretch>
+                      <a:fillRect/>
+                    </a:stretch>
+                  </pic:blipFill>
+                  <pic:spPr>
+                    <a:xfrm>
+                      <a:off x="0" y="0"/>
+                      <a:ext cx="5029200" cy="2236329"/>
+                    </a:xfrm>
+                    <a:prstGeom prst="rect"/>
+                  </pic:spPr>
+                </pic:pic>
+              </a:graphicData>
+            </a:graphic>
+          </wp:inline>
+        </w:drawing>
+      </w:r>
+    </w:p>
+    <w:p>
+      <w:pPr>
+        <w:spacing w:before="120" w:after="240"/>
+        <w:jc w:val="center"/>
+      </w:pPr>
+      <w:r>
+        <w:rPr>
+          <w:i/>
+          <w:sz w:val="18"/>
+        </w:rPr>
+        <w:t>Figure 5. Three-Layer Tempo Analogy: Population to GDP to Healthcare</w:t>
       </w:r>
     </w:p>
     <w:p>
@@ -810,7 +1262,7 @@
         <w:pStyle w:val="Heading2"/>
       </w:pPr>
       <w:r>
-        <w:t>2.3 Empirical Evidence for the HLGH</w:t>
+        <w:t>2.4 Empirical Evidence for the HLGH</w:t>
       </w:r>
     </w:p>
     <w:p>
@@ -1289,7 +1741,7 @@
         <w:drawing>
           <wp:inline xmlns:a="http://schemas.openxmlformats.org/drawingml/2006/main" xmlns:pic="http://schemas.openxmlformats.org/drawingml/2006/picture">
             <wp:extent cx="5029200" cy="3053140"/>
-            <wp:docPr id="2" name="Picture 2"/>
+            <wp:docPr id="3" name="Picture 3"/>
             <wp:cNvGraphicFramePr>
               <a:graphicFrameLocks noChangeAspect="1"/>
             </wp:cNvGraphicFramePr>
@@ -1301,7 +1753,7 @@
                     <pic:cNvPicPr/>
                   </pic:nvPicPr>
                   <pic:blipFill>
-                    <a:blip r:embed="rId10"/>
+                    <a:blip r:embed="rId11"/>
                     <a:stretch>
                       <a:fillRect/>
                     </a:stretch>
@@ -2206,7 +2658,7 @@
         <w:drawing>
           <wp:inline xmlns:a="http://schemas.openxmlformats.org/drawingml/2006/main" xmlns:pic="http://schemas.openxmlformats.org/drawingml/2006/picture">
             <wp:extent cx="5029200" cy="3143250"/>
-            <wp:docPr id="3" name="Picture 3"/>
+            <wp:docPr id="4" name="Picture 4"/>
             <wp:cNvGraphicFramePr>
               <a:graphicFrameLocks noChangeAspect="1"/>
             </wp:cNvGraphicFramePr>
@@ -2218,7 +2670,7 @@
                     <pic:cNvPicPr/>
                   </pic:nvPicPr>
                   <pic:blipFill>
-                    <a:blip r:embed="rId11"/>
+                    <a:blip r:embed="rId12"/>
                     <a:stretch>
                       <a:fillRect/>
                     </a:stretch>
@@ -2252,7 +2704,7 @@
     </w:p>
     <w:p>
       <w:r>
-        <w:t>Three of nine countries (Japan 1.09, France 1.18, Sweden 1.04) achieve a demand-side-only fiscal return ratio above 1.0. The remaining six countries range from 0.76 (Australia) to 0.96 (Germany), recovering the bulk of public expenditure through demand-side tax revenues alone. Germany (0.96) and the US (0.92) narrowly miss the threshold; Korea (0.86), Canada (0.82), the UK (0.78), and Australia (0.76) show progressively larger gaps. These gaps are expected to be closed by supply-side returns (health-capital accumulation) not captured in this demand-only metric. The finding that demand-side revenues alone recover 76-118% of public costs challenges the framing of healthcare as a pure fiscal drain.</w:t>
+        <w:t>Three of nine countries (Japan 1.09, France 1.18, Sweden 1.04) achieve a demand-side-only fiscal return ratio above 1.0. The remaining six countries range from 0.76 (Australia) to 0.96 (Germany), recovering the bulk of public expenditure through demand-side tax revenues alone. These gaps are expected to be closed by supply-side returns (health-capital accumulation) not captured in this demand-only metric.</w:t>
       </w:r>
     </w:p>
     <w:p>
@@ -2265,7 +2717,17 @@
     </w:p>
     <w:p>
       <w:r>
-        <w:t>The fiscal return ratio captures only the contemporaneous flow effect. The full economic value of healthcare spending also includes supply-side returns through future productivity gains from health-capital accumulation. Our tempo analysis showed that the spending-to-outcome lag mu_H drifts at +0.15 years/year, meaning current spending accumulates into a health-capital stock whose returns manifest in future periods. Evaluating by period outcomes alone thus underestimates the true return.</w:t>
+        <w:t>The fiscal return ratio captures only the contemporaneous flow effect. The full economic value of healthcare spending also includes supply-side returns through future productivity gains from health-capital accumulation. Candidate A-H showed that mu_H drifts at +0.15 yr/yr</w:t>
+      </w:r>
+      <w:r>
+        <w:rPr>
+          <w:sz w:val="16"/>
+          <w:vertAlign w:val="superscript"/>
+        </w:rPr>
+        <w:t>20</w:t>
+      </w:r>
+      <w:r>
+        <w:t>, meaning current spending accumulates into a health-capital stock whose returns manifest in future periods. Evaluating by period outcomes alone thus underestimates the true return.</w:t>
       </w:r>
     </w:p>
     <w:p>
@@ -2318,7 +2780,7 @@
         <w:drawing>
           <wp:inline xmlns:a="http://schemas.openxmlformats.org/drawingml/2006/main" xmlns:pic="http://schemas.openxmlformats.org/drawingml/2006/picture">
             <wp:extent cx="5029200" cy="3771900"/>
-            <wp:docPr id="4" name="Picture 4"/>
+            <wp:docPr id="5" name="Picture 5"/>
             <wp:cNvGraphicFramePr>
               <a:graphicFrameLocks noChangeAspect="1"/>
             </wp:cNvGraphicFramePr>
@@ -2330,7 +2792,7 @@
                     <pic:cNvPicPr/>
                   </pic:nvPicPr>
                   <pic:blipFill>
-                    <a:blip r:embed="rId12"/>
+                    <a:blip r:embed="rId13"/>
                     <a:stretch>
                       <a:fillRect/>
                     </a:stretch>
@@ -2364,17 +2826,27 @@
     </w:p>
     <w:p>
       <w:r>
-        <w:t>The US spends 17% of GDP on healthcare yet has below-OECD-average life expectancy — the textbook example of 'inefficiency.' From a neutral perspective, however: (1) the I-O multiplier of 1.7 generates approximately $1.0 trillion in additional output annually, and (2) the tempo drift suggests a portion of spending accumulates into future health capital. The issue is not the volume of spending but its composition — the shift from curative-heavy toward prevention and R&amp;D is key</w:t>
+        <w:t>The US spends 17% of GDP on healthcare yet has below-OECD-average life expectancy. Through the tempo lens, the US pattern is analogous to 'high period TFR, low cohort fertility' in demography</w:t>
       </w:r>
       <w:r>
         <w:rPr>
           <w:sz w:val="16"/>
           <w:vertAlign w:val="superscript"/>
         </w:rPr>
-        <w:t>1,10</w:t>
+        <w:t>17</w:t>
       </w:r>
       <w:r>
-        <w:t>.</w:t>
+        <w:t>: the flow (current spending) is large but the stock (health capital) accumulates inefficiently -- a tempo-inflated flow that overstates true investment</w:t>
+      </w:r>
+      <w:r>
+        <w:rPr>
+          <w:sz w:val="16"/>
+          <w:vertAlign w:val="superscript"/>
+        </w:rPr>
+        <w:t>19</w:t>
+      </w:r>
+      <w:r>
+        <w:t>. The issue is not the volume of spending but its composition -- the shift from curative-heavy toward prevention and R&amp;D is key.</w:t>
       </w:r>
     </w:p>
     <w:p>
@@ -2403,7 +2875,7 @@
         <w:pStyle w:val="Heading2"/>
       </w:pPr>
       <w:r>
-        <w:t>5.2 Implications of the Japan-US Comparison</w:t>
+        <w:t>5.2 Japan-US Comparison and Tempo Implications</w:t>
       </w:r>
     </w:p>
     <w:p>
@@ -2418,7 +2890,22 @@
         <w:t>3</w:t>
       </w:r>
       <w:r>
-        <w:t>. The difference in multipliers points to institutional design improvements, not to healthcare spending itself being 'too high.'</w:t>
+        <w:t>.</w:t>
+      </w:r>
+    </w:p>
+    <w:p>
+      <w:r>
+        <w:t>Adding the tempo perspective deepens this contrast. As the GDP paper's Section 6.4 suggests</w:t>
+      </w:r>
+      <w:r>
+        <w:rPr>
+          <w:sz w:val="16"/>
+          <w:vertAlign w:val="superscript"/>
+        </w:rPr>
+        <w:t>19</w:t>
+      </w:r>
+      <w:r>
+        <w:t>, the US has a low 'intangible health-capital share' -- spending is heavily weighted toward curative care (HC.1) rather than prevention (HC.6) or R&amp;D (HC.R), the healthcare analogue of the 'forgotten parameter' lambda_b. A curative-heavy composition simultaneously depresses the I-O multiplier (leakage abroad) and accelerates the tempo drift (outcomes take longer to materialize). Japan achieves higher stock accumulation per unit of spending but faces the risk that aging-driven growth of long-term care may accelerate mu_H drift.</w:t>
       </w:r>
     </w:p>
     <w:p>
@@ -2426,12 +2913,50 @@
         <w:pStyle w:val="Heading2"/>
       </w:pPr>
       <w:r>
-        <w:t>5.3 Limitations and Future Directions</w:t>
+        <w:t>5.3 Candidate D-H: The 'Forgotten Parameter' in Spending Composition</w:t>
       </w:r>
     </w:p>
     <w:p>
       <w:r>
-        <w:t>Several limitations apply. First, I-O multipliers are static models that do not account for price adjustments or supply constraints. Second, the fiscal return ratio depends on the effective tax rate parameter, requiring further refinement for robust international comparisons. Third, the tempo drift mu_H is a proxy for health-capital accumulation; direct causal inference requires additional identification strategies. Future work will use OECD SHA (System of Health Accounts) functional expenditure data to estimate bucket-specific multipliers (Candidate D-H) and determine which types of healthcare spending yield the highest returns.</w:t>
+        <w:t>The healthcare_tempo_poc implemented Candidate A-H (spending-to-outcome lag)</w:t>
+      </w:r>
+      <w:r>
+        <w:rPr>
+          <w:sz w:val="16"/>
+          <w:vertAlign w:val="superscript"/>
+        </w:rPr>
+        <w:t>20</w:t>
+      </w:r>
+      <w:r>
+        <w:t>. The most policy-relevant extension is Candidate D-H -- estimating bucket-specific outcome multipliers lambda_b by functional category from OECD SHA (System of Health Accounts) data. If curative (HC.1), long-term care (HC.3), prevention (HC.6), and R&amp;D (HC.R) carry different lambda_b values, the sustainability discussion shifts from 'how much to spend' to 'what to spend on.'</w:t>
+      </w:r>
+    </w:p>
+    <w:p>
+      <w:r>
+        <w:t>Just as the forgotten parameter beta (intangible capital share) reconciles flow and stock accounts in GDP</w:t>
+      </w:r>
+      <w:r>
+        <w:rPr>
+          <w:sz w:val="16"/>
+          <w:vertAlign w:val="superscript"/>
+        </w:rPr>
+        <w:t>19</w:t>
+      </w:r>
+      <w:r>
+        <w:t>, lambda_b (prevention/R&amp;D composition multiplier) is the forgotten parameter in healthcare accounting. This is the core of the third column in the three-layer analogy (Figure 5) and constitutes the primary empirical agenda going forward.</w:t>
+      </w:r>
+    </w:p>
+    <w:p>
+      <w:pPr>
+        <w:pStyle w:val="Heading2"/>
+      </w:pPr>
+      <w:r>
+        <w:t>5.4 Limitations and Future Directions</w:t>
+      </w:r>
+    </w:p>
+    <w:p>
+      <w:r>
+        <w:t>Several limitations apply. First, I-O multipliers are static models that do not account for price adjustments or supply constraints. Second, the fiscal return ratio depends on the effective tax rate parameter, requiring further refinement for robust international comparisons. Third, the tempo drift mu_H is a proxy for health-capital accumulation; direct causal inference requires additional identification strategies. Fourth, Candidates B-H (same-healthy-population) and D-H (bucket multipliers) require OECD SHA and WHO GHO data and are left for future work.</w:t>
       </w:r>
     </w:p>
     <w:p>
@@ -2444,7 +2969,52 @@
     </w:p>
     <w:p>
       <w:r>
-        <w:t>Healthcare expenditure is simultaneously a 'cost' and an 'economic effect.' I-O multipliers demonstrate that healthcare spending generates 1.7 to 2.9 times its value in economic output through direct, indirect, and induced effects. HLGH studies confirm bidirectional causality between health expenditure and GDP growth. Tempo analysis shows that contemporaneous flow indicators underestimate investment returns. Under the demand-side fiscal return ratio, three of nine countries exceed 1.0, and all nine recover at least 76% of public costs from demand-side tax revenues alone — before accounting for supply-side health-capital returns. The policy debate should shift from 'how to contain costs' to 'how to maximize the economic return on healthcare investment.'</w:t>
+        <w:t>Healthcare expenditure is simultaneously a 'cost' and an 'economic effect.' I-O multipliers demonstrate that healthcare spending generates 1.7 to 2.9 times its value in economic output. HLGH studies confirm bidirectional causality between health expenditure and GDP growth. Tempo analysis shows that contemporaneous flow indicators underestimate investment returns -- M2 (tempo model) outperforms M1 in 95% of countries with drift of +0.15 yr/yr, roughly four times GDP's +0.04</w:t>
+      </w:r>
+      <w:r>
+        <w:rPr>
+          <w:sz w:val="16"/>
+          <w:vertAlign w:val="superscript"/>
+        </w:rPr>
+        <w:t>19,20</w:t>
+      </w:r>
+      <w:r>
+        <w:t>.</w:t>
+      </w:r>
+    </w:p>
+    <w:p>
+      <w:r>
+        <w:t>Under the demand-side fiscal return ratio, three of nine countries exceed 1.0, and all nine recover at least 76% of public costs from demand-side tax revenues alone. The three-layer tempo structure -- Population</w:t>
+      </w:r>
+      <w:r>
+        <w:rPr>
+          <w:sz w:val="16"/>
+          <w:vertAlign w:val="superscript"/>
+        </w:rPr>
+        <w:t>17,18</w:t>
+      </w:r>
+      <w:r>
+        <w:t xml:space="preserve"> -&gt; GDP</w:t>
+      </w:r>
+      <w:r>
+        <w:rPr>
+          <w:sz w:val="16"/>
+          <w:vertAlign w:val="superscript"/>
+        </w:rPr>
+        <w:t>19</w:t>
+      </w:r>
+      <w:r>
+        <w:t xml:space="preserve"> -&gt; Healthcare</w:t>
+      </w:r>
+      <w:r>
+        <w:rPr>
+          <w:sz w:val="16"/>
+          <w:vertAlign w:val="superscript"/>
+        </w:rPr>
+        <w:t>20</w:t>
+      </w:r>
+      <w:r>
+        <w:t xml:space="preserve"> -- highlights a cross-domain pattern: flow-biased policy evaluation systematically underestimates stock accumulation. The policy debate should shift from 'how to contain costs' to 'how to maximize economic return on healthcare investment' -- and ultimately to 'what to spend on (composition optimization).'</w:t>
       </w:r>
     </w:p>
     <w:p>
@@ -2512,7 +3082,7 @@
         <w:rPr>
           <w:sz w:val="18"/>
         </w:rPr>
-        <w:t>Ertuğrul HM, Baycan O, Atilgan E, Ulucan H. Health-led growth hypothesis and health financing systems: an econometric synthesis for OECD countries. Front Public Health. 2024;12:1437304.</w:t>
+        <w:t>Ertugrul HM, Baycan O, Atilgan E, Ulucan H. Health-led growth hypothesis and health financing systems: an econometric synthesis for OECD countries. Front Public Health. 2024;12:1437304.</w:t>
       </w:r>
     </w:p>
     <w:p>
@@ -2662,7 +3232,7 @@
         <w:rPr>
           <w:sz w:val="18"/>
         </w:rPr>
-        <w:t>Piabuo SM, Tieguhong JC. Health expenditure and economic growth — a review of the literature and an analysis between the economic community for central African states (CEMAC) and selected African countries. Health Econ Rev. 2017;7(1):23.</w:t>
+        <w:t>Piabuo SM, Tieguhong JC. Health expenditure and economic growth -- a review of the literature and an analysis between the economic community for central African states (CEMAC) and selected African countries. Health Econ Rev. 2017;7(1):23.</w:t>
       </w:r>
     </w:p>
     <w:p>
@@ -2693,6 +3263,66 @@
           <w:sz w:val="18"/>
         </w:rPr>
         <w:t>Bloom DE, Canning D, Sevilla J. The effect of health on economic growth: a production function approach. World Dev. 2004;32(1):1-13.</w:t>
+      </w:r>
+    </w:p>
+    <w:p>
+      <w:r>
+        <w:rPr>
+          <w:b/>
+          <w:sz w:val="18"/>
+        </w:rPr>
+        <w:t xml:space="preserve">17. </w:t>
+      </w:r>
+      <w:r>
+        <w:rPr>
+          <w:sz w:val="18"/>
+        </w:rPr>
+        <w:t>Bongaarts J, Feeney G. On the quantum and tempo of fertility. Popul Dev Rev. 1998;24(2):271-291.</w:t>
+      </w:r>
+    </w:p>
+    <w:p>
+      <w:r>
+        <w:rPr>
+          <w:b/>
+          <w:sz w:val="18"/>
+        </w:rPr>
+        <w:t xml:space="preserve">18. </w:t>
+      </w:r>
+      <w:r>
+        <w:rPr>
+          <w:sz w:val="18"/>
+        </w:rPr>
+        <w:t>Goldstein JR, Lutz W, Scherbov S. Long-term population decline in Europe: the relative importance of tempo effects and generational length. Popul Dev Rev. 2003;29(4):699-707.</w:t>
+      </w:r>
+    </w:p>
+    <w:p>
+      <w:r>
+        <w:rPr>
+          <w:b/>
+          <w:sz w:val="18"/>
+        </w:rPr>
+        <w:t xml:space="preserve">19. </w:t>
+      </w:r>
+      <w:r>
+        <w:rPr>
+          <w:sz w:val="18"/>
+        </w:rPr>
+        <w:t>Onishi T. The forgotten tempo effect in capital accounting: investment-to-output time-to-build, intangible capital, and the reconciliation of flow- and stock-based national wealth measures. Working Paper. 2026.</w:t>
+      </w:r>
+    </w:p>
+    <w:p>
+      <w:r>
+        <w:rPr>
+          <w:b/>
+          <w:sz w:val="18"/>
+        </w:rPr>
+        <w:t xml:space="preserve">20. </w:t>
+      </w:r>
+      <w:r>
+        <w:rPr>
+          <w:sz w:val="18"/>
+        </w:rPr>
+        <w:t>Onishi T. Healthcare sustainable-spending composition via tempo + sigma framework: Candidate A-H proof of concept. Working Paper. 2026.</w:t>
       </w:r>
     </w:p>
     <w:sectPr>

</xml_diff>

<commit_message>
Add Preston Curve overfit analysis: quadratic term significant only with US (F=13.2 p<0.001 vs F=0.5 p=0.49)
New finding: the Preston-style 'diminishing returns' in OECD healthcare
spending vs life expectancy data is driven entirely by the US outlier.

Analysis:
- Nested F-test: with US (n=38) quadratic p<0.001; without US (n=37) p=0.49
- AIC/BIC favor linear without US
- LOOCV RMSE: linear 2.12 yr < quadratic 2.19 yr

Figure 5 now shows both fits: primary linear (red solid, US excluded)
and ghost quadratic (gray dashed, US included) with F-test annotation.

Added Preston (1975) as reference 22 in both JA/EN manuscripts.
Overfit stats saved to data/preston_overfit_test.json.

Co-Authored-By: Tatsuki Onishi <bougtoir@gmail.com>
</commit_message>
<xml_diff>
--- a/healthcare_economic_effect/output/docx/Healthcare_Economic_Effect_EN.docx
+++ b/healthcare_economic_effect/output/docx/Healthcare_Economic_Effect_EN.docx
@@ -3467,7 +3467,22 @@
         <w:t>12,21</w:t>
       </w:r>
       <w:r>
-        <w:t>. The linear fit (excluding the US as an outlier) shows a positive relationship, though additional spending beyond a certain level yields smaller life-expectancy gains. This apparent diminishing return may reflect the tempo effect (lengthening lag) rather than genuine inefficiency.</w:t>
+        <w:t>. Since Preston (1975), it has been widely assumed that this relationship follows a concave curve -- the 'Preston Curve' -- where returns to health spending diminish at higher income levels</w:t>
+      </w:r>
+      <w:r>
+        <w:rPr>
+          <w:sz w:val="16"/>
+          <w:vertAlign w:val="superscript"/>
+        </w:rPr>
+        <w:t>22</w:t>
+      </w:r>
+      <w:r>
+        <w:t>. We test this assumption directly using nested-model F-tests.</w:t>
+      </w:r>
+    </w:p>
+    <w:p>
+      <w:r>
+        <w:t>When the US is included (n=38), the quadratic term is highly significant (F=13.2, p&lt;0.001). However, when the US is excluded (n=37), the quadratic term becomes entirely non-significant (F=0.5, p=0.49). AIC and BIC both favor the linear model without the US, and Leave-One-Out cross-validation RMSE is lower for the linear fit (2.12 yr) than for the quadratic (2.19 yr). The Preston-style 'diminishing returns' in OECD healthcare spending data is thus an artifact of overfitting to a single outlier -- the United States. Figure 5 visualizes this comparison.</w:t>
       </w:r>
     </w:p>
     <w:p>
@@ -3477,7 +3492,7 @@
       <w:r>
         <w:drawing>
           <wp:inline xmlns:a="http://schemas.openxmlformats.org/drawingml/2006/main" xmlns:pic="http://schemas.openxmlformats.org/drawingml/2006/picture">
-            <wp:extent cx="5029200" cy="3771900"/>
+            <wp:extent cx="5029200" cy="3621325"/>
             <wp:docPr id="5" name="Picture 5"/>
             <wp:cNvGraphicFramePr>
               <a:graphicFrameLocks noChangeAspect="1"/>
@@ -3498,7 +3513,7 @@
                   <pic:spPr>
                     <a:xfrm>
                       <a:off x="0" y="0"/>
-                      <a:ext cx="5029200" cy="3771900"/>
+                      <a:ext cx="5029200" cy="3621325"/>
                     </a:xfrm>
                     <a:prstGeom prst="rect"/>
                   </pic:spPr>
@@ -3519,7 +3534,7 @@
           <w:i/>
           <w:sz w:val="18"/>
         </w:rPr>
-        <w:t>Figure 5. Healthcare Spending (% GDP) vs Life Expectancy (OECD, 2019; linear fit excludes US)</w:t>
+        <w:t>Figure 5. Healthcare Spending (% GDP) vs Life Expectancy (OECD, 2019). Red solid: linear fit excluding US. Gray dashed: quadratic fit including US (Preston-style). F-test results shown in figure.</w:t>
       </w:r>
     </w:p>
     <w:p>
@@ -3545,6 +3560,11 @@
       </w:r>
       <w:r>
         <w:t>. The issue is not the volume of spending but its composition -- the shift from curative-heavy toward prevention and R&amp;D is key.</w:t>
+      </w:r>
+    </w:p>
+    <w:p>
+      <w:r>
+        <w:t>This finding has important policy implications. The Preston Curve has been widely cited to argue that additional healthcare spending in high-income countries yields diminishing returns. If this 'diminishing return' is not statistically supported, the economic return on healthcare investment may be larger than conventionally assumed.</w:t>
       </w:r>
     </w:p>
     <w:p>
@@ -4038,6 +4058,21 @@
         <w:t>World Bank. World Development Indicators. Washington, DC: World Bank; 2024. Available from: https://databank.worldbank.org/</w:t>
       </w:r>
     </w:p>
+    <w:p>
+      <w:r>
+        <w:rPr>
+          <w:b/>
+          <w:sz w:val="18"/>
+        </w:rPr>
+        <w:t xml:space="preserve">22. </w:t>
+      </w:r>
+      <w:r>
+        <w:rPr>
+          <w:sz w:val="18"/>
+        </w:rPr>
+        <w:t>Preston SH. The changing relation between mortality and level of economic development. Popul Stud. 1975;29(2):231-248.</w:t>
+      </w:r>
+    </w:p>
     <w:sectPr>
       <w:pgSz w:w="12240" w:h="15840"/>
       <w:pgMar w:top="1440" w:right="1800" w:bottom="1440" w:left="1800" w:header="720" w:footer="720" w:gutter="0"/>

</xml_diff>

<commit_message>
Add medical equipment stock & import leakage analysis: equipment density comparison, import leakage model, Japan counterfactuals (3 scenarios), JA/EN figures with CJK font support
New section 4.2 in both manuscripts:
- Japan CT+MRI density 170.9/million (4x OECD median)
- Import leakage ~5% CHE reduces effective multiplier 2.78->2.64
- Counterfactual A (avg density): fiscal return drops to 0.98
- Counterfactual B (domestic mfg): fiscal return rises to 1.09
- Counterfactual C (both): 1.03 -- effects roughly offset
- Cross-country comparison of 13 OECD nations

New figures 6-8 (EN + JA versions), new data files, updated pptx.

Co-Authored-By: Tatsuki Onishi <bougtoir@gmail.com>
</commit_message>
<xml_diff>
--- a/healthcare_economic_effect/output/docx/Healthcare_Economic_Effect_EN.docx
+++ b/healthcare_economic_effect/output/docx/Healthcare_Economic_Effect_EN.docx
@@ -3569,6 +3569,215 @@
     </w:p>
     <w:p>
       <w:pPr>
+        <w:pStyle w:val="Heading2"/>
+      </w:pPr>
+      <w:r>
+        <w:t>4.2 Equipment Stock, Import Leakage, and Sustainability</w:t>
+      </w:r>
+    </w:p>
+    <w:p>
+      <w:r>
+        <w:t>Japan exhibits the highest diagnostic imaging density among OECD countries: 115.7 CT scanners and 55.2 MRI units per million population (OECD medians: approximately 27 and 19, respectively), far exceeding second-ranked Australia (CT: 70.2)</w:t>
+      </w:r>
+      <w:r>
+        <w:rPr>
+          <w:sz w:val="16"/>
+          <w:vertAlign w:val="superscript"/>
+        </w:rPr>
+        <w:t>23</w:t>
+      </w:r>
+      <w:r>
+        <w:t>. This equipment stock may function as 'diagnostic capital' that enhances health capital H(t) accumulation through earlier detection and treatment. Figure 6 shows imaging equipment density by country.</w:t>
+      </w:r>
+    </w:p>
+    <w:p>
+      <w:pPr>
+        <w:jc w:val="center"/>
+      </w:pPr>
+      <w:r>
+        <w:drawing>
+          <wp:inline xmlns:a="http://schemas.openxmlformats.org/drawingml/2006/main" xmlns:pic="http://schemas.openxmlformats.org/drawingml/2006/picture">
+            <wp:extent cx="5029200" cy="3341498"/>
+            <wp:docPr id="6" name="Picture 6"/>
+            <wp:cNvGraphicFramePr>
+              <a:graphicFrameLocks noChangeAspect="1"/>
+            </wp:cNvGraphicFramePr>
+            <a:graphic>
+              <a:graphicData uri="http://schemas.openxmlformats.org/drawingml/2006/picture">
+                <pic:pic>
+                  <pic:nvPicPr>
+                    <pic:cNvPr id="0" name="fig6_equipment_density.png"/>
+                    <pic:cNvPicPr/>
+                  </pic:nvPicPr>
+                  <pic:blipFill>
+                    <a:blip r:embed="rId14"/>
+                    <a:stretch>
+                      <a:fillRect/>
+                    </a:stretch>
+                  </pic:blipFill>
+                  <pic:spPr>
+                    <a:xfrm>
+                      <a:off x="0" y="0"/>
+                      <a:ext cx="5029200" cy="3341498"/>
+                    </a:xfrm>
+                    <a:prstGeom prst="rect"/>
+                  </pic:spPr>
+                </pic:pic>
+              </a:graphicData>
+            </a:graphic>
+          </wp:inline>
+        </w:drawing>
+      </w:r>
+    </w:p>
+    <w:p>
+      <w:pPr>
+        <w:spacing w:before="120" w:after="240"/>
+        <w:jc w:val="center"/>
+      </w:pPr>
+      <w:r>
+        <w:rPr>
+          <w:i/>
+          <w:sz w:val="18"/>
+        </w:rPr>
+        <w:t>Figure 6. Diagnostic imaging equipment density (CT+MRI per million population, OECD 2021). Japan (red) at 170.9 per million is approximately 4x the OECD median.</w:t>
+      </w:r>
+    </w:p>
+    <w:p>
+      <w:r>
+        <w:t>However, Japan is also a net importer of medical devices and pharmaceuticals. Pharmaceutical imports total approximately USD 28.5 billion against exports of USD 5.1 billion; net imports (approx. USD 23.4 billion) represent approximately 5.0% of current health expenditure (CHE)</w:t>
+      </w:r>
+      <w:r>
+        <w:rPr>
+          <w:sz w:val="16"/>
+          <w:vertAlign w:val="superscript"/>
+        </w:rPr>
+        <w:t>24</w:t>
+      </w:r>
+      <w:r>
+        <w:t>. Including medical devices, the total medical import leakage is approximately 5.0% of CHE.</w:t>
+      </w:r>
+    </w:p>
+    <w:p>
+      <w:r>
+        <w:t>To quantify this effect on the I-O multiplier, we define the effective multiplier as m_eff = m x (1 - leakage). For Japan, the nominal multiplier of 2.78 becomes an effective multiplier of 2.64, and the fiscal return ratio falls from 1.09 to 1.04 -- still above 1.0, maintaining demand-side sustainability. Figure 7 shows the relationship between import leakage and effective multipliers across countries.</w:t>
+      </w:r>
+    </w:p>
+    <w:p>
+      <w:pPr>
+        <w:jc w:val="center"/>
+      </w:pPr>
+      <w:r>
+        <w:drawing>
+          <wp:inline xmlns:a="http://schemas.openxmlformats.org/drawingml/2006/main" xmlns:pic="http://schemas.openxmlformats.org/drawingml/2006/picture">
+            <wp:extent cx="5029200" cy="3643140"/>
+            <wp:docPr id="7" name="Picture 7"/>
+            <wp:cNvGraphicFramePr>
+              <a:graphicFrameLocks noChangeAspect="1"/>
+            </wp:cNvGraphicFramePr>
+            <a:graphic>
+              <a:graphicData uri="http://schemas.openxmlformats.org/drawingml/2006/picture">
+                <pic:pic>
+                  <pic:nvPicPr>
+                    <pic:cNvPr id="0" name="fig7_import_leakage_multiplier.png"/>
+                    <pic:cNvPicPr/>
+                  </pic:nvPicPr>
+                  <pic:blipFill>
+                    <a:blip r:embed="rId15"/>
+                    <a:stretch>
+                      <a:fillRect/>
+                    </a:stretch>
+                  </pic:blipFill>
+                  <pic:spPr>
+                    <a:xfrm>
+                      <a:off x="0" y="0"/>
+                      <a:ext cx="5029200" cy="3643140"/>
+                    </a:xfrm>
+                    <a:prstGeom prst="rect"/>
+                  </pic:spPr>
+                </pic:pic>
+              </a:graphicData>
+            </a:graphic>
+          </wp:inline>
+        </w:drawing>
+      </w:r>
+    </w:p>
+    <w:p>
+      <w:pPr>
+        <w:spacing w:before="120" w:after="240"/>
+        <w:jc w:val="center"/>
+      </w:pPr>
+      <w:r>
+        <w:rPr>
+          <w:i/>
+          <w:sz w:val="18"/>
+        </w:rPr>
+        <w:t>Figure 7. Medical import leakage (% of CHE) vs effective I-O multiplier. Gray x markers show unadjusted nominal multipliers. Red arrow for Japan shows the leakage adjustment effect.</w:t>
+      </w:r>
+    </w:p>
+    <w:p>
+      <w:r>
+        <w:t>Counterfactual analysis for Japan separates the effects of equipment density and import leakage (Figure 8). Scenario A (reducing to OECD-average equipment density) lowers the fiscal return ratio to 0.98, eliminating sustainability. Scenario B (domestic manufacturing, zero import leakage) raises it to 1.09. Scenario C (both: average equipment + domestic manufacturing) yields 1.03, showing that equipment reduction and leakage elimination roughly offset.</w:t>
+      </w:r>
+    </w:p>
+    <w:p>
+      <w:pPr>
+        <w:jc w:val="center"/>
+      </w:pPr>
+      <w:r>
+        <w:drawing>
+          <wp:inline xmlns:a="http://schemas.openxmlformats.org/drawingml/2006/main" xmlns:pic="http://schemas.openxmlformats.org/drawingml/2006/picture">
+            <wp:extent cx="5029200" cy="3120988"/>
+            <wp:docPr id="8" name="Picture 8"/>
+            <wp:cNvGraphicFramePr>
+              <a:graphicFrameLocks noChangeAspect="1"/>
+            </wp:cNvGraphicFramePr>
+            <a:graphic>
+              <a:graphicData uri="http://schemas.openxmlformats.org/drawingml/2006/picture">
+                <pic:pic>
+                  <pic:nvPicPr>
+                    <pic:cNvPr id="0" name="fig8_counterfactual_japan.png"/>
+                    <pic:cNvPicPr/>
+                  </pic:nvPicPr>
+                  <pic:blipFill>
+                    <a:blip r:embed="rId16"/>
+                    <a:stretch>
+                      <a:fillRect/>
+                    </a:stretch>
+                  </pic:blipFill>
+                  <pic:spPr>
+                    <a:xfrm>
+                      <a:off x="0" y="0"/>
+                      <a:ext cx="5029200" cy="3120988"/>
+                    </a:xfrm>
+                    <a:prstGeom prst="rect"/>
+                  </pic:spPr>
+                </pic:pic>
+              </a:graphicData>
+            </a:graphic>
+          </wp:inline>
+        </w:drawing>
+      </w:r>
+    </w:p>
+    <w:p>
+      <w:pPr>
+        <w:spacing w:before="120" w:after="240"/>
+        <w:jc w:val="center"/>
+      </w:pPr>
+      <w:r>
+        <w:rPr>
+          <w:i/>
+          <w:sz w:val="18"/>
+        </w:rPr>
+        <w:t>Figure 8. Japan counterfactual analysis. Baseline (1.04), A: OECD-average equipment (0.98), B: Domestic manufacturing (1.09), C: Both (1.03). Dashed line: sustainability threshold 1.0.</w:t>
+      </w:r>
+    </w:p>
+    <w:p>
+      <w:r>
+        <w:t>These findings have important policy implications. First, Japan's high imaging density is not 'excessive' but functions as diagnostic capital stock that contributes to sustainability. Reducing density to the OECD average would eliminate sustainability. Second, domestic manufacturing of medical devices and pharmaceuticals would improve the effective multiplier by approximately 5%. Third, regarding exportability: countries with medical trade surpluses (Germany, Italy) already have zero import leakage and higher effective multipliers, while import-dependent countries (Canada: 8.5%, Australia: 7.1%) have room for domestic manufacturing gains similar to Japan.</w:t>
+      </w:r>
+    </w:p>
+    <w:p>
+      <w:pPr>
         <w:pStyle w:val="Heading1"/>
       </w:pPr>
       <w:r>
@@ -3624,6 +3833,11 @@
       </w:r>
       <w:r>
         <w:t>, the US has a low 'intangible health-capital share' -- spending is heavily weighted toward curative care (HC.1) rather than prevention (HC.6) or R&amp;D (HC.R), the healthcare analogue of the 'forgotten parameter' lambda_b. A curative-heavy composition simultaneously depresses the I-O multiplier (leakage abroad) and accelerates the tempo drift (outcomes take longer to materialize). Japan achieves higher stock accumulation per unit of spending but faces the risk that aging-driven growth of long-term care may accelerate mu_H drift.</w:t>
+      </w:r>
+    </w:p>
+    <w:p>
+      <w:r>
+        <w:t>The equipment stock and import leakage analysis in Section 4.2 adds a new dimension to this Japan-US contrast. Japan's diagnostic imaging density is approximately 4 times the OECD average, and this 'diagnostic capital' amplifies health capital accumulation through earlier detection and treatment. Counterfactual analysis shows that reducing equipment density would eliminate sustainability (ratio falls to 0.98), demonstrating quantitatively that high density functions as a component of sustainability, not excess. Meanwhile, import leakage (approximately 5%) offers room for improvement: domestic manufacturing could restore the effective multiplier from 2.64 to 2.78.</w:t>
       </w:r>
     </w:p>
     <w:p>
@@ -4073,6 +4287,36 @@
         <w:t>Preston SH. The changing relation between mortality and level of economic development. Popul Stud. 1975;29(2):231-248.</w:t>
       </w:r>
     </w:p>
+    <w:p>
+      <w:r>
+        <w:rPr>
+          <w:b/>
+          <w:sz w:val="18"/>
+        </w:rPr>
+        <w:t xml:space="preserve">23. </w:t>
+      </w:r>
+      <w:r>
+        <w:rPr>
+          <w:sz w:val="18"/>
+        </w:rPr>
+        <w:t>OECD. Health at a Glance 2023: OECD Indicators. Paris: OECD Publishing; 2023. Chapter 5.23: Diagnostic technologies.</w:t>
+      </w:r>
+    </w:p>
+    <w:p>
+      <w:r>
+        <w:rPr>
+          <w:b/>
+          <w:sz w:val="18"/>
+        </w:rPr>
+        <w:t xml:space="preserve">24. </w:t>
+      </w:r>
+      <w:r>
+        <w:rPr>
+          <w:sz w:val="18"/>
+        </w:rPr>
+        <w:t>Ministry of Health, Labour and Welfare. Pharmaceutical and medical device production statistics annual report. Tokyo: MHLW; 2021. [In Japanese]</w:t>
+      </w:r>
+    </w:p>
     <w:sectPr>
       <w:pgSz w:w="12240" w:h="15840"/>
       <w:pgMar w:top="1440" w:right="1800" w:bottom="1440" w:left="1800" w:header="720" w:footer="720" w:gutter="0"/>

</xml_diff>